<commit_message>
Expand PowerPoint to 20 slides and remove Kernaussagen labels
- Removed the "Kernaussagen" headings on all stat slides; keyword chips
  now sit directly under each chart for a cleaner look.
- Added 3 new slides:
  * Folie 16 — Wie funktioniert KI-gestützte Steuerprüfung? (4-step flow)
  * Folie 17 — Chancen & Risiken des KI-Einsatzes (Pro/Contra)
  * Folie 18 — Ausblick: Was kommt 2026 und danach? (Roadmap 2025-2028+)
- Updated speaker script with narration, cues, and pauses for the new
  slides; total runtime now ~12-14 minutes.

https://claude.ai/code/session_01MdzJJUoHUKeykvjoVMaxnm
</commit_message>
<xml_diff>
--- a/output/Vortragsskript_KI_Steuerhinterziehung.docx
+++ b/output/Vortragsskript_KI_Steuerhinterziehung.docx
@@ -42,7 +42,7 @@
           <w:color w:val="556073"/>
           <w:sz w:val="22"/>
         </w:rPr>
-        <w:t>von Bastian &amp; Ibrahim  ·  Dauer: ca. 10–12 Minuten  ·  17 Folien</w:t>
+        <w:t>von Bastian &amp; Ibrahim  ·  Dauer: ca. 12–14 Minuten  ·  20 Folien</w:t>
       </w:r>
     </w:p>
     <w:p>
@@ -1377,7 +1377,409 @@
           <w:color w:val="556073"/>
           <w:sz w:val="22"/>
         </w:rPr>
-        <w:t>Folie 16</w:t>
+        <w:t>Folie 16 · Funktionsweise</w:t>
+      </w:r>
+    </w:p>
+    <w:p>
+      <w:pPr>
+        <w:keepNext/>
+        <w:spacing w:before="0" w:after="120"/>
+      </w:pPr>
+      <w:r>
+        <w:rPr>
+          <w:rFonts w:ascii="Calibri" w:hAnsi="Calibri"/>
+          <w:b/>
+          <w:color w:val="0B1E3F"/>
+          <w:sz w:val="30"/>
+        </w:rPr>
+        <w:t>Wie funktioniert KI-gestützte Steuerprüfung?</w:t>
+      </w:r>
+    </w:p>
+    <w:p>
+      <w:pPr>
+        <w:spacing w:before="40" w:after="40"/>
+        <w:shd w:val="clear" w:color="auto" w:fill="F5E9C8"/>
+      </w:pPr>
+      <w:r>
+        <w:rPr>
+          <w:rFonts w:ascii="Calibri" w:hAnsi="Calibri"/>
+          <w:b/>
+          <w:color w:val="009580"/>
+          <w:sz w:val="18"/>
+        </w:rPr>
+        <w:t xml:space="preserve">REGIE: </w:t>
+      </w:r>
+      <w:r>
+        <w:rPr>
+          <w:rFonts w:ascii="Calibri" w:hAnsi="Calibri"/>
+          <w:i/>
+          <w:color w:val="556073"/>
+          <w:sz w:val="18"/>
+        </w:rPr>
+        <w:t>Mit dem Finger den Weg von links nach rechts nachzeichnen.</w:t>
+      </w:r>
+    </w:p>
+    <w:p>
+      <w:pPr>
+        <w:spacing w:before="60" w:after="120" w:line="324" w:lineRule="auto"/>
+      </w:pPr>
+      <w:r>
+        <w:rPr>
+          <w:rFonts w:ascii="Calibri" w:hAnsi="Calibri"/>
+          <w:sz w:val="23"/>
+        </w:rPr>
+        <w:t>Vielleicht fragt ihr euch jetzt: Wie läuft so eine KI-Prüfung in der Praxis ab? Im Kern sind es vier Schritte.</w:t>
+      </w:r>
+    </w:p>
+    <w:p>
+      <w:pPr>
+        <w:spacing w:before="60" w:after="120" w:line="324" w:lineRule="auto"/>
+      </w:pPr>
+      <w:r>
+        <w:rPr>
+          <w:rFonts w:ascii="Calibri" w:hAnsi="Calibri"/>
+          <w:sz w:val="23"/>
+        </w:rPr>
+        <w:t>Schritt eins ist die Datenerfassung: Die Behörde sammelt Steuererklärungen, Rechnungen, Bankdaten und die internationalen Meldungen aus CRS und CbCR — wir kommen gleich noch dazu.</w:t>
+      </w:r>
+    </w:p>
+    <w:p>
+      <w:pPr>
+        <w:spacing w:before="60" w:after="120" w:line="324" w:lineRule="auto"/>
+      </w:pPr>
+      <w:r>
+        <w:rPr>
+          <w:rFonts w:ascii="Calibri" w:hAnsi="Calibri"/>
+          <w:sz w:val="23"/>
+        </w:rPr>
+        <w:t>Schritt zwei: Die KI-Analyse. Hier kommen die großen Sprachmodelle und Big-Data-Methoden ins Spiel. Sie erkennen Muster, die ein Mensch in dieser Datenmenge nie sehen könnte — zum Beispiel auffällige Verbindungen zwischen Firmen, die niemandem aufgefallen wären.</w:t>
+      </w:r>
+    </w:p>
+    <w:p>
+      <w:pPr>
+        <w:spacing w:before="60" w:after="120" w:line="324" w:lineRule="auto"/>
+      </w:pPr>
+      <w:r>
+        <w:rPr>
+          <w:rFonts w:ascii="Calibri" w:hAnsi="Calibri"/>
+          <w:sz w:val="23"/>
+        </w:rPr>
+        <w:t>Schritt drei ist das Risiko-Scoring. Jeder Fall bekommt eine Punktzahl: low, mid oder high risk. So weiß die Behörde sofort, wo sich genaueres Hinschauen lohnt.</w:t>
+      </w:r>
+    </w:p>
+    <w:p>
+      <w:pPr>
+        <w:spacing w:before="60" w:after="120" w:line="324" w:lineRule="auto"/>
+      </w:pPr>
+      <w:r>
+        <w:rPr>
+          <w:rFonts w:ascii="Calibri" w:hAnsi="Calibri"/>
+          <w:sz w:val="23"/>
+        </w:rPr>
+        <w:t>Und Schritt vier — das ist der wichtigste: Ein Mensch entscheidet. Die KI schlägt vor, der Steuerprüfer prüft und unterschreibt. Das ist das Prinzip „Human in the Loop", das wir am Anfang erwähnt haben.</w:t>
+      </w:r>
+    </w:p>
+    <w:p>
+      <w:pPr>
+        <w:spacing w:after="80"/>
+      </w:pPr>
+      <w:r>
+        <w:rPr>
+          <w:i/>
+          <w:color w:val="556073"/>
+          <w:sz w:val="18"/>
+        </w:rPr>
+        <w:t>〔kurze Pause – Folie wirken lassen〕</w:t>
+      </w:r>
+    </w:p>
+    <w:p>
+      <w:pPr>
+        <w:keepNext/>
+        <w:spacing w:before="280" w:after="80"/>
+        <w:shd w:val="clear" w:color="auto" w:fill="EAF4F2"/>
+      </w:pPr>
+      <w:r>
+        <w:rPr>
+          <w:rFonts w:ascii="Calibri" w:hAnsi="Calibri"/>
+          <w:b/>
+          <w:color w:val="009580"/>
+          <w:sz w:val="22"/>
+        </w:rPr>
+        <w:t xml:space="preserve">  Folie 17 · </w:t>
+      </w:r>
+      <w:r>
+        <w:rPr>
+          <w:rFonts w:ascii="Calibri" w:hAnsi="Calibri"/>
+          <w:b w:val="0"/>
+          <w:i/>
+          <w:color w:val="556073"/>
+          <w:sz w:val="22"/>
+        </w:rPr>
+        <w:t>Folie 17 · Bewertung</w:t>
+      </w:r>
+    </w:p>
+    <w:p>
+      <w:pPr>
+        <w:keepNext/>
+        <w:spacing w:before="0" w:after="120"/>
+      </w:pPr>
+      <w:r>
+        <w:rPr>
+          <w:rFonts w:ascii="Calibri" w:hAnsi="Calibri"/>
+          <w:b/>
+          <w:color w:val="0B1E3F"/>
+          <w:sz w:val="30"/>
+        </w:rPr>
+        <w:t>Chancen und Risiken des KI-Einsatzes</w:t>
+      </w:r>
+    </w:p>
+    <w:p>
+      <w:pPr>
+        <w:spacing w:before="40" w:after="40"/>
+        <w:shd w:val="clear" w:color="auto" w:fill="F5E9C8"/>
+      </w:pPr>
+      <w:r>
+        <w:rPr>
+          <w:rFonts w:ascii="Calibri" w:hAnsi="Calibri"/>
+          <w:b/>
+          <w:color w:val="009580"/>
+          <w:sz w:val="18"/>
+        </w:rPr>
+        <w:t xml:space="preserve">REGIE: </w:t>
+      </w:r>
+      <w:r>
+        <w:rPr>
+          <w:rFonts w:ascii="Calibri" w:hAnsi="Calibri"/>
+          <w:i/>
+          <w:color w:val="556073"/>
+          <w:sz w:val="18"/>
+        </w:rPr>
+        <w:t>Erst die grüne Seite (Chancen), dann die orange Seite (Risiken). Stimme leicht senken bei den Risiken.</w:t>
+      </w:r>
+    </w:p>
+    <w:p>
+      <w:pPr>
+        <w:spacing w:before="60" w:after="120" w:line="324" w:lineRule="auto"/>
+      </w:pPr>
+      <w:r>
+        <w:rPr>
+          <w:rFonts w:ascii="Calibri" w:hAnsi="Calibri"/>
+          <w:sz w:val="23"/>
+        </w:rPr>
+        <w:t>So beeindruckend KI klingt — wir müssen auch ehrlich über die Schattenseiten reden.</w:t>
+      </w:r>
+    </w:p>
+    <w:p>
+      <w:pPr>
+        <w:spacing w:before="60" w:after="120" w:line="324" w:lineRule="auto"/>
+      </w:pPr>
+      <w:r>
+        <w:rPr>
+          <w:rFonts w:ascii="Calibri" w:hAnsi="Calibri"/>
+          <w:sz w:val="23"/>
+        </w:rPr>
+        <w:t>Auf der Chancen-Seite stehen klare Vorteile: Millionen Fälle können schneller bearbeitet werden, komplexe Betrugsmuster fallen endlich auf, die Beamten werden entlastet und der Staat bekommt Geld zurück, das ihm zusteht.</w:t>
+      </w:r>
+    </w:p>
+    <w:p>
+      <w:pPr>
+        <w:spacing w:before="60" w:after="120" w:line="324" w:lineRule="auto"/>
+      </w:pPr>
+      <w:r>
+        <w:rPr>
+          <w:rFonts w:ascii="Calibri" w:hAnsi="Calibri"/>
+          <w:sz w:val="23"/>
+        </w:rPr>
+        <w:t>Auf der Risiko-Seite sieht es so aus: Datenschutz ist ein echtes Thema — die KI sieht extrem persönliche Daten. False Positives, also falsche Treffer, können unschuldige Steuerzahler ins Visier nehmen. Das berühmte Black-Box-Problem: Niemand kann wirklich erklären, warum die KI zu einer bestimmten Entscheidung kommt. Dazu die Abhängigkeit von Tech-Anbietern und natürlich die hohen Kosten.</w:t>
+      </w:r>
+    </w:p>
+    <w:p>
+      <w:pPr>
+        <w:spacing w:before="60" w:after="120" w:line="324" w:lineRule="auto"/>
+      </w:pPr>
+      <w:r>
+        <w:rPr>
+          <w:rFonts w:ascii="Calibri" w:hAnsi="Calibri"/>
+          <w:sz w:val="23"/>
+        </w:rPr>
+        <w:t>Unser Fazit dazu: Genau deshalb ist „Human in the Loop" so wichtig. Die KI darf unterstützen, aber nicht ersetzen.</w:t>
+      </w:r>
+    </w:p>
+    <w:p>
+      <w:pPr>
+        <w:spacing w:after="80"/>
+      </w:pPr>
+      <w:r>
+        <w:rPr>
+          <w:i/>
+          <w:color w:val="556073"/>
+          <w:sz w:val="18"/>
+        </w:rPr>
+        <w:t>〔kurze Pause – Folie wirken lassen〕</w:t>
+      </w:r>
+    </w:p>
+    <w:p>
+      <w:pPr>
+        <w:keepNext/>
+        <w:spacing w:before="280" w:after="80"/>
+        <w:shd w:val="clear" w:color="auto" w:fill="EAF4F2"/>
+      </w:pPr>
+      <w:r>
+        <w:rPr>
+          <w:rFonts w:ascii="Calibri" w:hAnsi="Calibri"/>
+          <w:b/>
+          <w:color w:val="009580"/>
+          <w:sz w:val="22"/>
+        </w:rPr>
+        <w:t xml:space="preserve">  Folie 18 · </w:t>
+      </w:r>
+      <w:r>
+        <w:rPr>
+          <w:rFonts w:ascii="Calibri" w:hAnsi="Calibri"/>
+          <w:b w:val="0"/>
+          <w:i/>
+          <w:color w:val="556073"/>
+          <w:sz w:val="22"/>
+        </w:rPr>
+        <w:t>Folie 18 · Roadmap</w:t>
+      </w:r>
+    </w:p>
+    <w:p>
+      <w:pPr>
+        <w:keepNext/>
+        <w:spacing w:before="0" w:after="120"/>
+      </w:pPr>
+      <w:r>
+        <w:rPr>
+          <w:rFonts w:ascii="Calibri" w:hAnsi="Calibri"/>
+          <w:b/>
+          <w:color w:val="0B1E3F"/>
+          <w:sz w:val="30"/>
+        </w:rPr>
+        <w:t>Ausblick – Was kommt 2026 und danach?</w:t>
+      </w:r>
+    </w:p>
+    <w:p>
+      <w:pPr>
+        <w:spacing w:before="40" w:after="40"/>
+        <w:shd w:val="clear" w:color="auto" w:fill="F5E9C8"/>
+      </w:pPr>
+      <w:r>
+        <w:rPr>
+          <w:rFonts w:ascii="Calibri" w:hAnsi="Calibri"/>
+          <w:b/>
+          <w:color w:val="009580"/>
+          <w:sz w:val="18"/>
+        </w:rPr>
+        <w:t xml:space="preserve">REGIE: </w:t>
+      </w:r>
+      <w:r>
+        <w:rPr>
+          <w:rFonts w:ascii="Calibri" w:hAnsi="Calibri"/>
+          <w:i/>
+          <w:color w:val="556073"/>
+          <w:sz w:val="18"/>
+        </w:rPr>
+        <w:t>Mit dem Finger der Zeitleiste von links nach rechts folgen.</w:t>
+      </w:r>
+    </w:p>
+    <w:p>
+      <w:pPr>
+        <w:spacing w:before="60" w:after="120" w:line="324" w:lineRule="auto"/>
+      </w:pPr>
+      <w:r>
+        <w:rPr>
+          <w:rFonts w:ascii="Calibri" w:hAnsi="Calibri"/>
+          <w:sz w:val="23"/>
+        </w:rPr>
+        <w:t>Zum Schluss noch ein Blick in die Zukunft. Wo geht die Reise hin?</w:t>
+      </w:r>
+    </w:p>
+    <w:p>
+      <w:pPr>
+        <w:spacing w:before="60" w:after="120" w:line="324" w:lineRule="auto"/>
+      </w:pPr>
+      <w:r>
+        <w:rPr>
+          <w:rFonts w:ascii="Calibri" w:hAnsi="Calibri"/>
+          <w:sz w:val="23"/>
+        </w:rPr>
+        <w:t>2025 — also dieses Jahr — startet das NRW-Pilotprojekt mit Fraunhofer IAIS. RAG-Systeme arbeiten gegen Terrorfinanzierung.</w:t>
+      </w:r>
+    </w:p>
+    <w:p>
+      <w:pPr>
+        <w:spacing w:before="60" w:after="120" w:line="324" w:lineRule="auto"/>
+      </w:pPr>
+      <w:r>
+        <w:rPr>
+          <w:rFonts w:ascii="Calibri" w:hAnsi="Calibri"/>
+          <w:sz w:val="23"/>
+        </w:rPr>
+        <w:t>2026 kommt der flächendeckende Roll-out: KI-Module werden in der ganzen Steuerveranlagung eingesetzt — zunächst für risikoarme Fälle, später für komplexere.</w:t>
+      </w:r>
+    </w:p>
+    <w:p>
+      <w:pPr>
+        <w:spacing w:before="60" w:after="120" w:line="324" w:lineRule="auto"/>
+      </w:pPr>
+      <w:r>
+        <w:rPr>
+          <w:rFonts w:ascii="Calibri" w:hAnsi="Calibri"/>
+          <w:sz w:val="23"/>
+        </w:rPr>
+        <w:t>2027 wird DAC 8 verbindlich — die Krypto-Daten fließen dann EU-weit automatisch.</w:t>
+      </w:r>
+    </w:p>
+    <w:p>
+      <w:pPr>
+        <w:spacing w:before="60" w:after="120" w:line="324" w:lineRule="auto"/>
+      </w:pPr>
+      <w:r>
+        <w:rPr>
+          <w:rFonts w:ascii="Calibri" w:hAnsi="Calibri"/>
+          <w:sz w:val="23"/>
+        </w:rPr>
+        <w:t>Und ab 2028: KI wird zum Standard-Werkzeug, mit Echtzeit-Prüfung und automatischen Vorabentscheidungen für klare Fälle. Die Vision für 2030: KI als ganz selbstverständlicher Partner in jeder Finanzbehörde.</w:t>
+      </w:r>
+    </w:p>
+    <w:p>
+      <w:pPr>
+        <w:spacing w:after="80"/>
+      </w:pPr>
+      <w:r>
+        <w:rPr>
+          <w:i/>
+          <w:color w:val="556073"/>
+          <w:sz w:val="18"/>
+        </w:rPr>
+        <w:t>〔kurze Pause – Folie wirken lassen〕</w:t>
+      </w:r>
+    </w:p>
+    <w:p>
+      <w:pPr>
+        <w:keepNext/>
+        <w:spacing w:before="280" w:after="80"/>
+        <w:shd w:val="clear" w:color="auto" w:fill="EAF4F2"/>
+      </w:pPr>
+      <w:r>
+        <w:rPr>
+          <w:rFonts w:ascii="Calibri" w:hAnsi="Calibri"/>
+          <w:b/>
+          <w:color w:val="009580"/>
+          <w:sz w:val="22"/>
+        </w:rPr>
+        <w:t xml:space="preserve">  Folie 19 · </w:t>
+      </w:r>
+      <w:r>
+        <w:rPr>
+          <w:rFonts w:ascii="Calibri" w:hAnsi="Calibri"/>
+          <w:b w:val="0"/>
+          <w:i/>
+          <w:color w:val="556073"/>
+          <w:sz w:val="22"/>
+        </w:rPr>
+        <w:t>Folie 19</w:t>
       </w:r>
     </w:p>
     <w:p>
@@ -1492,7 +1894,7 @@
           <w:color w:val="009580"/>
           <w:sz w:val="22"/>
         </w:rPr>
-        <w:t xml:space="preserve">  Folie 17 · </w:t>
+        <w:t xml:space="preserve">  Folie 20 · </w:t>
       </w:r>
       <w:r>
         <w:rPr>
@@ -1502,7 +1904,7 @@
           <w:color w:val="556073"/>
           <w:sz w:val="22"/>
         </w:rPr>
-        <w:t>Folie 17</w:t>
+        <w:t>Folie 20</w:t>
       </w:r>
     </w:p>
     <w:p>

</xml_diff>

<commit_message>
Update speaker script for 9-theme agenda
Inhaltsverzeichnis-Block in the script now says "neun Schritten" and
includes a brief mention of the three additional sections (KI-Funktionsweise,
Chancen & Risiken, Ausblick) so the spoken intro matches the new TOC.

https://claude.ai/code/session_01MdzJJUoHUKeykvjoVMaxnm
</commit_message>
<xml_diff>
--- a/output/Vortragsskript_KI_Steuerhinterziehung.docx
+++ b/output/Vortragsskript_KI_Steuerhinterziehung.docx
@@ -271,7 +271,7 @@
           <w:color w:val="556073"/>
           <w:sz w:val="18"/>
         </w:rPr>
-        <w:t>Kurz mit der Hand über die sechs Punkte streichen — nicht jeden vorlesen.</w:t>
+        <w:t>Kurz mit der Hand über die neun Punkte streichen — nicht jeden vorlesen.</w:t>
       </w:r>
     </w:p>
     <w:p>
@@ -283,7 +283,19 @@
           <w:rFonts w:ascii="Calibri" w:hAnsi="Calibri"/>
           <w:sz w:val="23"/>
         </w:rPr>
-        <w:t>Wir nehmen euch in sechs Schritten mit: Zuerst zeigen wir, wie KI in Nordrhein-Westfalen aufgebaut wird. Dann stellen wir das neue Pilotprojekt vom Juni 2025 vor. Anschließend kommen wir zum Umsatzsteuerbetrug, zur Finanzkriminalität mit Krypto, sehen uns die Gegenspieler an — also das Ausmaß des Schadens — und werfen am Ende einen Blick über den Tellerrand.</w:t>
+        <w:t>Wir nehmen euch in neun Schritten mit. Zuerst zeigen wir, wie KI in Nordrhein-Westfalen aufgebaut wird, und stellen das neue Pilotprojekt vom Juni 2025 vor. Danach geht es um Umsatzsteuerbetrug und um Finanzkriminalität mit Krypto.</w:t>
+      </w:r>
+    </w:p>
+    <w:p>
+      <w:pPr>
+        <w:spacing w:before="60" w:after="120" w:line="324" w:lineRule="auto"/>
+      </w:pPr>
+      <w:r>
+        <w:rPr>
+          <w:rFonts w:ascii="Calibri" w:hAnsi="Calibri"/>
+          <w:sz w:val="23"/>
+        </w:rPr>
+        <w:t>Anschließend sehen wir uns die Gegenspieler an — also das Ausmaß des Schadens — und werfen einen Blick über den Tellerrand zu den internationalen Abkommen. Zum Schluss erklären wir noch, wie eine KI-Steuerprüfung konkret funktioniert, sprechen über Chancen und Risiken und schließen mit einem Ausblick auf 2026 und danach.</w:t>
       </w:r>
     </w:p>
     <w:p>

</xml_diff>